<commit_message>
push code giao dien chinh
</commit_message>
<xml_diff>
--- a/bin/ThongBao.docx
+++ b/bin/ThongBao.docx
@@ -397,6 +397,402 @@
         <w:t>Nhanh tay nhận voucher và thưởng thức những ly cà phê thơm ngon ngay hôm nay!</w:t>
       </w:r>
     </w:p>
+    <w:p>
+      <w:pPr>
+        <w:jc w:val="center"/>
+        <w:rPr>
+          <w:rFonts w:ascii="Times New Roman" w:hAnsi="Times New Roman" w:cs="Times New Roman"/>
+          <w:b/>
+          <w:bCs/>
+          <w:sz w:val="32"/>
+          <w:szCs w:val="32"/>
+        </w:rPr>
+      </w:pPr>
+      <w:r>
+        <w:rPr>
+          <w:rFonts w:ascii="Segoe UI Emoji" w:hAnsi="Segoe UI Emoji" w:cs="Segoe UI Emoji"/>
+          <w:b/>
+          <w:bCs/>
+          <w:sz w:val="32"/>
+          <w:szCs w:val="32"/>
+        </w:rPr>
+        <w:t>📢</w:t>
+      </w:r>
+      <w:r>
+        <w:rPr>
+          <w:rFonts w:ascii="Times New Roman" w:hAnsi="Times New Roman" w:cs="Times New Roman"/>
+          <w:b/>
+          <w:bCs/>
+          <w:sz w:val="32"/>
+          <w:szCs w:val="32"/>
+        </w:rPr>
+        <w:t xml:space="preserve"> THÔNG BÁO CHƯƠNG TRÌNH BÁN HÀNG &amp; ƯU ĐÃI VOUCHER </w:t>
+      </w:r>
+      <w:r>
+        <w:rPr>
+          <w:rFonts w:ascii="Segoe UI Emoji" w:hAnsi="Segoe UI Emoji" w:cs="Segoe UI Emoji"/>
+          <w:b/>
+          <w:bCs/>
+          <w:sz w:val="32"/>
+          <w:szCs w:val="32"/>
+        </w:rPr>
+        <w:t>☕</w:t>
+      </w:r>
+    </w:p>
+    <w:p>
+      <w:pPr>
+        <w:rPr>
+          <w:rFonts w:ascii="Times New Roman" w:hAnsi="Times New Roman" w:cs="Times New Roman"/>
+          <w:sz w:val="32"/>
+          <w:szCs w:val="32"/>
+        </w:rPr>
+      </w:pPr>
+      <w:r>
+        <w:rPr>
+          <w:rFonts w:ascii="Times New Roman" w:hAnsi="Times New Roman" w:cs="Times New Roman"/>
+          <w:sz w:val="32"/>
+          <w:szCs w:val="32"/>
+        </w:rPr>
+        <w:t>Nhằm tri ân khách hàng và kích cầu mua sắm, quán triển khai chương trình ưu đãi đặc biệt:</w:t>
+      </w:r>
+    </w:p>
+    <w:p>
+      <w:pPr>
+        <w:rPr>
+          <w:rFonts w:ascii="Times New Roman" w:hAnsi="Times New Roman" w:cs="Times New Roman"/>
+          <w:b/>
+          <w:bCs/>
+          <w:sz w:val="32"/>
+          <w:szCs w:val="32"/>
+        </w:rPr>
+      </w:pPr>
+      <w:r>
+        <w:rPr>
+          <w:rFonts w:ascii="Segoe UI Emoji" w:hAnsi="Segoe UI Emoji" w:cs="Segoe UI Emoji"/>
+          <w:b/>
+          <w:bCs/>
+          <w:sz w:val="32"/>
+          <w:szCs w:val="32"/>
+        </w:rPr>
+        <w:t>🎉</w:t>
+      </w:r>
+      <w:r>
+        <w:rPr>
+          <w:rFonts w:ascii="Times New Roman" w:hAnsi="Times New Roman" w:cs="Times New Roman"/>
+          <w:b/>
+          <w:bCs/>
+          <w:sz w:val="32"/>
+          <w:szCs w:val="32"/>
+        </w:rPr>
+        <w:t xml:space="preserve"> CHƯƠNG TRÌNH KHUYẾN MÃI</w:t>
+      </w:r>
+    </w:p>
+    <w:p>
+      <w:pPr>
+        <w:rPr>
+          <w:rFonts w:ascii="Times New Roman" w:hAnsi="Times New Roman" w:cs="Times New Roman"/>
+          <w:sz w:val="32"/>
+          <w:szCs w:val="32"/>
+        </w:rPr>
+      </w:pPr>
+      <w:r>
+        <w:rPr>
+          <w:rFonts w:ascii="Segoe UI Symbol" w:hAnsi="Segoe UI Symbol" w:cs="Segoe UI Symbol"/>
+          <w:sz w:val="32"/>
+          <w:szCs w:val="32"/>
+        </w:rPr>
+        <w:t>🎟</w:t>
+      </w:r>
+      <w:r>
+        <w:rPr>
+          <w:rFonts w:ascii="Times New Roman" w:hAnsi="Times New Roman" w:cs="Times New Roman"/>
+          <w:sz w:val="32"/>
+          <w:szCs w:val="32"/>
+        </w:rPr>
+        <w:t xml:space="preserve"> </w:t>
+      </w:r>
+      <w:r>
+        <w:rPr>
+          <w:rFonts w:ascii="Times New Roman" w:hAnsi="Times New Roman" w:cs="Times New Roman"/>
+          <w:b/>
+          <w:bCs/>
+          <w:sz w:val="32"/>
+          <w:szCs w:val="32"/>
+        </w:rPr>
+        <w:t>Giảm 20%</w:t>
+      </w:r>
+      <w:r>
+        <w:rPr>
+          <w:rFonts w:ascii="Times New Roman" w:hAnsi="Times New Roman" w:cs="Times New Roman"/>
+          <w:sz w:val="32"/>
+          <w:szCs w:val="32"/>
+        </w:rPr>
+        <w:t xml:space="preserve"> toàn bộ menu (áp dụng từ ngày … đến …)</w:t>
+      </w:r>
+      <w:r>
+        <w:rPr>
+          <w:rFonts w:ascii="Times New Roman" w:hAnsi="Times New Roman" w:cs="Times New Roman"/>
+          <w:sz w:val="32"/>
+          <w:szCs w:val="32"/>
+        </w:rPr>
+        <w:br/>
+      </w:r>
+      <w:r>
+        <w:rPr>
+          <w:rFonts w:ascii="Segoe UI Symbol" w:hAnsi="Segoe UI Symbol" w:cs="Segoe UI Symbol"/>
+          <w:sz w:val="32"/>
+          <w:szCs w:val="32"/>
+        </w:rPr>
+        <w:t>🎟</w:t>
+      </w:r>
+      <w:r>
+        <w:rPr>
+          <w:rFonts w:ascii="Times New Roman" w:hAnsi="Times New Roman" w:cs="Times New Roman"/>
+          <w:sz w:val="32"/>
+          <w:szCs w:val="32"/>
+        </w:rPr>
+        <w:t xml:space="preserve"> </w:t>
+      </w:r>
+      <w:r>
+        <w:rPr>
+          <w:rFonts w:ascii="Times New Roman" w:hAnsi="Times New Roman" w:cs="Times New Roman"/>
+          <w:b/>
+          <w:bCs/>
+          <w:sz w:val="32"/>
+          <w:szCs w:val="32"/>
+        </w:rPr>
+        <w:t>Mua 2 tặng 1</w:t>
+      </w:r>
+      <w:r>
+        <w:rPr>
+          <w:rFonts w:ascii="Times New Roman" w:hAnsi="Times New Roman" w:cs="Times New Roman"/>
+          <w:sz w:val="32"/>
+          <w:szCs w:val="32"/>
+        </w:rPr>
+        <w:t xml:space="preserve"> cho các món best-seller</w:t>
+      </w:r>
+      <w:r>
+        <w:rPr>
+          <w:rFonts w:ascii="Times New Roman" w:hAnsi="Times New Roman" w:cs="Times New Roman"/>
+          <w:sz w:val="32"/>
+          <w:szCs w:val="32"/>
+        </w:rPr>
+        <w:br/>
+      </w:r>
+      <w:r>
+        <w:rPr>
+          <w:rFonts w:ascii="Segoe UI Symbol" w:hAnsi="Segoe UI Symbol" w:cs="Segoe UI Symbol"/>
+          <w:sz w:val="32"/>
+          <w:szCs w:val="32"/>
+        </w:rPr>
+        <w:t>🎟</w:t>
+      </w:r>
+      <w:r>
+        <w:rPr>
+          <w:rFonts w:ascii="Times New Roman" w:hAnsi="Times New Roman" w:cs="Times New Roman"/>
+          <w:sz w:val="32"/>
+          <w:szCs w:val="32"/>
+        </w:rPr>
+        <w:t xml:space="preserve"> Tặng </w:t>
+      </w:r>
+      <w:r>
+        <w:rPr>
+          <w:rFonts w:ascii="Times New Roman" w:hAnsi="Times New Roman" w:cs="Times New Roman"/>
+          <w:b/>
+          <w:bCs/>
+          <w:sz w:val="32"/>
+          <w:szCs w:val="32"/>
+        </w:rPr>
+        <w:t>voucher 30.000đ</w:t>
+      </w:r>
+      <w:r>
+        <w:rPr>
+          <w:rFonts w:ascii="Times New Roman" w:hAnsi="Times New Roman" w:cs="Times New Roman"/>
+          <w:sz w:val="32"/>
+          <w:szCs w:val="32"/>
+        </w:rPr>
+        <w:t xml:space="preserve"> cho hóa đơn từ 150.000đ</w:t>
+      </w:r>
+    </w:p>
+    <w:p>
+      <w:pPr>
+        <w:rPr>
+          <w:rFonts w:ascii="Times New Roman" w:hAnsi="Times New Roman" w:cs="Times New Roman"/>
+          <w:sz w:val="32"/>
+          <w:szCs w:val="32"/>
+          <w:lang w:val="vi-VN"/>
+        </w:rPr>
+      </w:pPr>
+      <w:r>
+        <w:rPr>
+          <w:rFonts w:ascii="Segoe UI Emoji" w:hAnsi="Segoe UI Emoji" w:cs="Segoe UI Emoji"/>
+          <w:sz w:val="32"/>
+          <w:szCs w:val="32"/>
+        </w:rPr>
+        <w:t>⏳</w:t>
+      </w:r>
+      <w:r>
+        <w:rPr>
+          <w:rFonts w:ascii="Times New Roman" w:hAnsi="Times New Roman" w:cs="Times New Roman"/>
+          <w:sz w:val="32"/>
+          <w:szCs w:val="32"/>
+        </w:rPr>
+        <w:t xml:space="preserve"> Thời gian áp dụng: …</w:t>
+      </w:r>
+      <w:r>
+        <w:rPr>
+          <w:rFonts w:ascii="Times New Roman" w:hAnsi="Times New Roman" w:cs="Times New Roman"/>
+          <w:sz w:val="32"/>
+          <w:szCs w:val="32"/>
+        </w:rPr>
+        <w:br/>
+      </w:r>
+      <w:r>
+        <w:rPr>
+          <w:rFonts w:ascii="Segoe UI Emoji" w:hAnsi="Segoe UI Emoji" w:cs="Segoe UI Emoji"/>
+          <w:sz w:val="32"/>
+          <w:szCs w:val="32"/>
+        </w:rPr>
+        <w:t>📍</w:t>
+      </w:r>
+      <w:r>
+        <w:rPr>
+          <w:rFonts w:ascii="Times New Roman" w:hAnsi="Times New Roman" w:cs="Times New Roman"/>
+          <w:sz w:val="32"/>
+          <w:szCs w:val="32"/>
+        </w:rPr>
+        <w:t xml:space="preserve"> Áp dụng tại cửa hàng / đặt hàng trực tiếp</w:t>
+      </w:r>
+    </w:p>
+    <w:p>
+      <w:pPr>
+        <w:rPr>
+          <w:rFonts w:ascii="Times New Roman" w:hAnsi="Times New Roman" w:cs="Times New Roman"/>
+          <w:b/>
+          <w:bCs/>
+          <w:sz w:val="32"/>
+          <w:szCs w:val="32"/>
+        </w:rPr>
+      </w:pPr>
+      <w:r>
+        <w:rPr>
+          <w:rFonts w:ascii="Segoe UI Emoji" w:hAnsi="Segoe UI Emoji" w:cs="Segoe UI Emoji"/>
+          <w:b/>
+          <w:bCs/>
+          <w:sz w:val="32"/>
+          <w:szCs w:val="32"/>
+        </w:rPr>
+        <w:t>💳</w:t>
+      </w:r>
+      <w:r>
+        <w:rPr>
+          <w:rFonts w:ascii="Times New Roman" w:hAnsi="Times New Roman" w:cs="Times New Roman"/>
+          <w:b/>
+          <w:bCs/>
+          <w:sz w:val="32"/>
+          <w:szCs w:val="32"/>
+        </w:rPr>
+        <w:t xml:space="preserve"> THÔNG TIN VOUCHER</w:t>
+      </w:r>
+    </w:p>
+    <w:p>
+      <w:pPr>
+        <w:numPr>
+          <w:ilvl w:val="0"/>
+          <w:numId w:val="1"/>
+        </w:numPr>
+        <w:rPr>
+          <w:rFonts w:ascii="Times New Roman" w:hAnsi="Times New Roman" w:cs="Times New Roman"/>
+          <w:sz w:val="32"/>
+          <w:szCs w:val="32"/>
+        </w:rPr>
+      </w:pPr>
+      <w:r>
+        <w:rPr>
+          <w:rFonts w:ascii="Times New Roman" w:hAnsi="Times New Roman" w:cs="Times New Roman"/>
+          <w:sz w:val="32"/>
+          <w:szCs w:val="32"/>
+        </w:rPr>
+        <w:t>Voucher có giá trị sử dụng trong vòng 30 ngày</w:t>
+      </w:r>
+    </w:p>
+    <w:p>
+      <w:pPr>
+        <w:numPr>
+          <w:ilvl w:val="0"/>
+          <w:numId w:val="1"/>
+        </w:numPr>
+        <w:rPr>
+          <w:rFonts w:ascii="Times New Roman" w:hAnsi="Times New Roman" w:cs="Times New Roman"/>
+          <w:sz w:val="32"/>
+          <w:szCs w:val="32"/>
+        </w:rPr>
+      </w:pPr>
+      <w:r>
+        <w:rPr>
+          <w:rFonts w:ascii="Times New Roman" w:hAnsi="Times New Roman" w:cs="Times New Roman"/>
+          <w:sz w:val="32"/>
+          <w:szCs w:val="32"/>
+        </w:rPr>
+        <w:t>Không áp dụng đồng thời với chương trình khác</w:t>
+      </w:r>
+    </w:p>
+    <w:p>
+      <w:pPr>
+        <w:numPr>
+          <w:ilvl w:val="0"/>
+          <w:numId w:val="1"/>
+        </w:numPr>
+        <w:rPr>
+          <w:rFonts w:ascii="Times New Roman" w:hAnsi="Times New Roman" w:cs="Times New Roman"/>
+          <w:sz w:val="32"/>
+          <w:szCs w:val="32"/>
+        </w:rPr>
+      </w:pPr>
+      <w:r>
+        <w:rPr>
+          <w:rFonts w:ascii="Times New Roman" w:hAnsi="Times New Roman" w:cs="Times New Roman"/>
+          <w:sz w:val="32"/>
+          <w:szCs w:val="32"/>
+        </w:rPr>
+        <w:t>Số lượng có hạn, phát đến khi hết</w:t>
+      </w:r>
+    </w:p>
+    <w:p>
+      <w:pPr>
+        <w:rPr>
+          <w:rFonts w:ascii="Times New Roman" w:hAnsi="Times New Roman" w:cs="Times New Roman"/>
+          <w:sz w:val="32"/>
+          <w:szCs w:val="32"/>
+        </w:rPr>
+      </w:pPr>
+      <w:r>
+        <w:rPr>
+          <w:rFonts w:ascii="Segoe UI Emoji" w:hAnsi="Segoe UI Emoji" w:cs="Segoe UI Emoji"/>
+          <w:sz w:val="32"/>
+          <w:szCs w:val="32"/>
+        </w:rPr>
+        <w:t>❤️</w:t>
+      </w:r>
+      <w:r>
+        <w:rPr>
+          <w:rFonts w:ascii="Times New Roman" w:hAnsi="Times New Roman" w:cs="Times New Roman"/>
+          <w:sz w:val="32"/>
+          <w:szCs w:val="32"/>
+        </w:rPr>
+        <w:t xml:space="preserve"> Rất mong tiếp tục nhận được sự ủng hộ của quý khách.</w:t>
+      </w:r>
+      <w:r>
+        <w:rPr>
+          <w:rFonts w:ascii="Times New Roman" w:hAnsi="Times New Roman" w:cs="Times New Roman"/>
+          <w:sz w:val="32"/>
+          <w:szCs w:val="32"/>
+        </w:rPr>
+        <w:br/>
+        <w:t>Nhanh tay nhận voucher và thưởng thức những ly cà phê thơm ngon ngay hôm nay!</w:t>
+      </w:r>
+    </w:p>
+    <w:p/>
     <w:p/>
     <w:sectPr>
       <w:pgSz w:w="12240" w:h="15840"/>

</xml_diff>